<commit_message>
Correct author name capitalization
</commit_message>
<xml_diff>
--- a/05_manuscript/English_Manuscript.docx
+++ b/05_manuscript/English_Manuscript.docx
@@ -67,7 +67,7 @@
           <w:color w:val="000000"/>
           <w:sz w:val="21"/>
         </w:rPr>
-        <w:t xml:space="preserve"> BoTao Cai</w:t>
+        <w:t xml:space="preserve"> Botao Cai</w:t>
       </w:r>
     </w:p>
     <w:p>
@@ -119,7 +119,7 @@
           <w:color w:val="000000"/>
           <w:sz w:val="21"/>
         </w:rPr>
-        <w:t xml:space="preserve"> BoTao Cai, xcai2004xcai@gmail.com</w:t>
+        <w:t xml:space="preserve"> Botao Cai, xcai2004xcai@gmail.com</w:t>
       </w:r>
     </w:p>
     <w:p>
@@ -1773,7 +1773,7 @@
           <w:color w:val="000000"/>
           <w:sz w:val="22"/>
         </w:rPr>
-        <w:t>BoTao Cai: conceptualization, methodology, software, formal analysis, investigation, data curation, visualization, writing of the original draft, review and editing, and project administration.</w:t>
+        <w:t>Botao Cai: conceptualization, methodology, software, formal analysis, investigation, data curation, visualization, writing of the original draft, review and editing, and project administration.</w:t>
       </w:r>
     </w:p>
     <w:p>

</xml_diff>